<commit_message>
Avance Update Word V3 CYRGO
</commit_message>
<xml_diff>
--- a/webapp/templates/word/Otro_Si_Alimentacion_15.docx
+++ b/webapp/templates/word/Otro_Si_Alimentacion_15.docx
@@ -1,6 +1,6 @@
 
 <file path=word/document.xml><?xml version="1.0" encoding="utf-8"?>
-<w:document xmlns:wpc="http://schemas.microsoft.com/office/word/2010/wordprocessingCanvas" xmlns:cx="http://schemas.microsoft.com/office/drawing/2014/chartex" xmlns:cx1="http://schemas.microsoft.com/office/drawing/2015/9/8/chartex" xmlns:cx2="http://schemas.microsoft.com/office/drawing/2015/10/21/chartex" xmlns:cx3="http://schemas.microsoft.com/office/drawing/2016/5/9/chartex" xmlns:cx4="http://schemas.microsoft.com/office/drawing/2016/5/10/chartex" xmlns:cx5="http://schemas.microsoft.com/office/drawing/2016/5/11/chartex" xmlns:cx6="http://schemas.microsoft.com/office/drawing/2016/5/12/chartex" xmlns:cx7="http://schemas.microsoft.com/office/drawing/2016/5/13/chartex" xmlns:cx8="http://schemas.microsoft.com/office/drawing/2016/5/14/chartex" xmlns:mc="http://schemas.openxmlformats.org/markup-compatibility/2006" xmlns:aink="http://schemas.microsoft.com/office/drawing/2016/ink" xmlns:am3d="http://schemas.microsoft.com/office/drawing/2017/model3d" xmlns:o="urn:schemas-microsoft-com:office:office" xmlns:r="http://schemas.openxmlformats.org/officeDocument/2006/relationships" xmlns:m="http://schemas.openxmlformats.org/officeDocument/2006/math" xmlns:v="urn:schemas-microsoft-com:vml" xmlns:wp14="http://schemas.microsoft.com/office/word/2010/wordprocessingDrawing" xmlns:wp="http://schemas.openxmlformats.org/drawingml/2006/wordprocessingDrawing" xmlns:w10="urn:schemas-microsoft-com:office:word" xmlns:w="http://schemas.openxmlformats.org/wordprocessingml/2006/main" xmlns:w14="http://schemas.microsoft.com/office/word/2010/wordml" xmlns:w15="http://schemas.microsoft.com/office/word/2012/wordml" xmlns:w16cex="http://schemas.microsoft.com/office/word/2018/wordml/cex" xmlns:w16cid="http://schemas.microsoft.com/office/word/2016/wordml/cid" xmlns:w16="http://schemas.microsoft.com/office/word/2018/wordml" xmlns:w16sdtdh="http://schemas.microsoft.com/office/word/2020/wordml/sdtdatahash" xmlns:w16se="http://schemas.microsoft.com/office/word/2015/wordml/symex" xmlns:wpg="http://schemas.microsoft.com/office/word/2010/wordprocessingGroup" xmlns:wpi="http://schemas.microsoft.com/office/word/2010/wordprocessingInk" xmlns:wne="http://schemas.microsoft.com/office/word/2006/wordml" xmlns:wps="http://schemas.microsoft.com/office/word/2010/wordprocessingShape" mc:Ignorable="w14 w15 w16se w16cid w16 w16cex w16sdtdh wp14">
+<w:document xmlns:wpc="http://schemas.microsoft.com/office/word/2010/wordprocessingCanvas" xmlns:cx="http://schemas.microsoft.com/office/drawing/2014/chartex" xmlns:cx1="http://schemas.microsoft.com/office/drawing/2015/9/8/chartex" xmlns:cx2="http://schemas.microsoft.com/office/drawing/2015/10/21/chartex" xmlns:cx3="http://schemas.microsoft.com/office/drawing/2016/5/9/chartex" xmlns:cx4="http://schemas.microsoft.com/office/drawing/2016/5/10/chartex" xmlns:cx5="http://schemas.microsoft.com/office/drawing/2016/5/11/chartex" xmlns:cx6="http://schemas.microsoft.com/office/drawing/2016/5/12/chartex" xmlns:cx7="http://schemas.microsoft.com/office/drawing/2016/5/13/chartex" xmlns:cx8="http://schemas.microsoft.com/office/drawing/2016/5/14/chartex" xmlns:mc="http://schemas.openxmlformats.org/markup-compatibility/2006" xmlns:aink="http://schemas.microsoft.com/office/drawing/2016/ink" xmlns:am3d="http://schemas.microsoft.com/office/drawing/2017/model3d" xmlns:o="urn:schemas-microsoft-com:office:office" xmlns:oel="http://schemas.microsoft.com/office/2019/extlst" xmlns:r="http://schemas.openxmlformats.org/officeDocument/2006/relationships" xmlns:m="http://schemas.openxmlformats.org/officeDocument/2006/math" xmlns:v="urn:schemas-microsoft-com:vml" xmlns:wp14="http://schemas.microsoft.com/office/word/2010/wordprocessingDrawing" xmlns:wp="http://schemas.openxmlformats.org/drawingml/2006/wordprocessingDrawing" xmlns:w10="urn:schemas-microsoft-com:office:word" xmlns:w="http://schemas.openxmlformats.org/wordprocessingml/2006/main" xmlns:w14="http://schemas.microsoft.com/office/word/2010/wordml" xmlns:w15="http://schemas.microsoft.com/office/word/2012/wordml" xmlns:w16cex="http://schemas.microsoft.com/office/word/2018/wordml/cex" xmlns:w16cid="http://schemas.microsoft.com/office/word/2016/wordml/cid" xmlns:w16="http://schemas.microsoft.com/office/word/2018/wordml" xmlns:w16sdtdh="http://schemas.microsoft.com/office/word/2020/wordml/sdtdatahash" xmlns:w16se="http://schemas.microsoft.com/office/word/2015/wordml/symex" xmlns:wpg="http://schemas.microsoft.com/office/word/2010/wordprocessingGroup" xmlns:wpi="http://schemas.microsoft.com/office/word/2010/wordprocessingInk" xmlns:wne="http://schemas.microsoft.com/office/word/2006/wordml" xmlns:wps="http://schemas.microsoft.com/office/word/2010/wordprocessingShape" mc:Ignorable="w14 w15 w16se w16cid w16 w16cex w16sdtdh wp14">
   <w:body>
     <w:p>
       <w:pPr>
@@ -60,7 +60,6 @@
           <w:rFonts w:ascii="Calibri" w:eastAsia="Calibri" w:hAnsi="Calibri" w:cs="Calibri"/>
           <w:sz w:val="23"/>
           <w:szCs w:val="23"/>
-          <w:highlight w:val="magenta"/>
           <w:lang w:val="es-ES"/>
         </w:rPr>
         <w:t xml:space="preserve">En </w:t>
@@ -72,33 +71,28 @@
           <w:bCs/>
           <w:sz w:val="23"/>
           <w:szCs w:val="23"/>
-          <w:highlight w:val="magenta"/>
           <w:lang w:val="es-ES"/>
         </w:rPr>
-        <w:t>[[</w:t>
-      </w:r>
-      <w:proofErr w:type="spellStart"/>
-      <w:r>
-        <w:rPr>
-          <w:rFonts w:ascii="Calibri" w:eastAsia="Calibri" w:hAnsi="Calibri" w:cs="Calibri"/>
-          <w:b/>
-          <w:bCs/>
-          <w:sz w:val="23"/>
-          <w:szCs w:val="23"/>
-          <w:highlight w:val="magenta"/>
+        <w:t>[[Ciudad</w:t>
+      </w:r>
+      <w:r>
+        <w:rPr>
+          <w:rFonts w:ascii="Calibri" w:eastAsia="Calibri" w:hAnsi="Calibri" w:cs="Calibri"/>
+          <w:b/>
+          <w:bCs/>
+          <w:sz w:val="23"/>
+          <w:szCs w:val="23"/>
           <w:lang w:val="es-ES"/>
         </w:rPr>
-        <w:t>CiudadWork</w:t>
-      </w:r>
-      <w:proofErr w:type="spellEnd"/>
-      <w:r>
-        <w:rPr>
-          <w:rFonts w:ascii="Calibri" w:eastAsia="Calibri" w:hAnsi="Calibri" w:cs="Calibri"/>
-          <w:b/>
-          <w:bCs/>
-          <w:sz w:val="23"/>
-          <w:szCs w:val="23"/>
-          <w:highlight w:val="magenta"/>
+        <w:t>Firma</w:t>
+      </w:r>
+      <w:r>
+        <w:rPr>
+          <w:rFonts w:ascii="Calibri" w:eastAsia="Calibri" w:hAnsi="Calibri" w:cs="Calibri"/>
+          <w:b/>
+          <w:bCs/>
+          <w:sz w:val="23"/>
+          <w:szCs w:val="23"/>
           <w:lang w:val="es-ES"/>
         </w:rPr>
         <w:t>]]</w:t>
@@ -108,7 +102,6 @@
           <w:rFonts w:ascii="Calibri" w:eastAsia="Calibri" w:hAnsi="Calibri" w:cs="Calibri"/>
           <w:sz w:val="23"/>
           <w:szCs w:val="23"/>
-          <w:highlight w:val="magenta"/>
           <w:lang w:val="es-ES"/>
         </w:rPr>
         <w:t xml:space="preserve"> a los </w:t>
@@ -120,35 +113,426 @@
           <w:bCs/>
           <w:sz w:val="23"/>
           <w:szCs w:val="23"/>
-          <w:highlight w:val="magenta"/>
           <w:lang w:val="es-ES"/>
         </w:rPr>
-        <w:t>[[</w:t>
-      </w:r>
-      <w:proofErr w:type="spellStart"/>
-      <w:r>
-        <w:rPr>
-          <w:rFonts w:ascii="Calibri" w:eastAsia="Calibri" w:hAnsi="Calibri" w:cs="Calibri"/>
-          <w:b/>
-          <w:bCs/>
-          <w:sz w:val="23"/>
-          <w:szCs w:val="23"/>
-          <w:highlight w:val="magenta"/>
+        <w:t>[[FechaLarga]]</w:t>
+      </w:r>
+      <w:r>
+        <w:rPr>
+          <w:rFonts w:ascii="Calibri" w:eastAsia="Calibri" w:hAnsi="Calibri" w:cs="Calibri"/>
+          <w:sz w:val="23"/>
+          <w:szCs w:val="23"/>
           <w:lang w:val="es-ES"/>
         </w:rPr>
-        <w:t>FechaLarga</w:t>
-      </w:r>
-      <w:proofErr w:type="spellEnd"/>
-      <w:r>
-        <w:rPr>
-          <w:rFonts w:ascii="Calibri" w:eastAsia="Calibri" w:hAnsi="Calibri" w:cs="Calibri"/>
-          <w:b/>
-          <w:bCs/>
-          <w:sz w:val="23"/>
-          <w:szCs w:val="23"/>
-          <w:highlight w:val="magenta"/>
+        <w:t xml:space="preserve"> se reunieron por una parte </w:t>
+      </w:r>
+      <w:r>
+        <w:rPr>
+          <w:rFonts w:ascii="Calibri" w:eastAsia="Calibri" w:hAnsi="Calibri" w:cs="Calibri"/>
+          <w:b/>
+          <w:bCs/>
+          <w:sz w:val="23"/>
+          <w:szCs w:val="23"/>
           <w:lang w:val="es-ES"/>
         </w:rPr>
+        <w:t>[[Nombre]]</w:t>
+      </w:r>
+      <w:r>
+        <w:rPr>
+          <w:rFonts w:ascii="Calibri" w:eastAsia="Calibri" w:hAnsi="Calibri" w:cs="Calibri"/>
+          <w:sz w:val="23"/>
+          <w:szCs w:val="23"/>
+          <w:lang w:val="es-ES"/>
+        </w:rPr>
+        <w:t xml:space="preserve"> identificado(a) </w:t>
+      </w:r>
+      <w:r>
+        <w:rPr>
+          <w:rFonts w:ascii="Calibri" w:eastAsia="Calibri" w:hAnsi="Calibri" w:cs="Calibri"/>
+          <w:b/>
+          <w:bCs/>
+          <w:sz w:val="23"/>
+          <w:szCs w:val="23"/>
+          <w:lang w:val="es-ES"/>
+        </w:rPr>
+        <w:t>CC No</w:t>
+      </w:r>
+      <w:r>
+        <w:rPr>
+          <w:rFonts w:ascii="Calibri" w:eastAsia="Calibri" w:hAnsi="Calibri" w:cs="Calibri"/>
+          <w:sz w:val="23"/>
+          <w:szCs w:val="23"/>
+          <w:lang w:val="es-ES"/>
+        </w:rPr>
+        <w:t xml:space="preserve"> </w:t>
+      </w:r>
+      <w:r>
+        <w:rPr>
+          <w:rFonts w:ascii="Calibri" w:eastAsia="Calibri" w:hAnsi="Calibri" w:cs="Calibri"/>
+          <w:b/>
+          <w:bCs/>
+          <w:sz w:val="23"/>
+          <w:szCs w:val="23"/>
+          <w:lang w:val="es-ES"/>
+        </w:rPr>
+        <w:t xml:space="preserve">[[Cedula]] </w:t>
+      </w:r>
+      <w:r>
+        <w:rPr>
+          <w:rFonts w:ascii="Calibri" w:eastAsia="Calibri" w:hAnsi="Calibri" w:cs="Calibri"/>
+          <w:sz w:val="23"/>
+          <w:szCs w:val="23"/>
+        </w:rPr>
+        <w:t xml:space="preserve">como aparece al pie de su firma y quien actúa en su propio nombre y por la otra, </w:t>
+      </w:r>
+      <w:r>
+        <w:rPr>
+          <w:rFonts w:ascii="Calibri" w:eastAsia="Calibri" w:hAnsi="Calibri" w:cs="Calibri"/>
+          <w:b/>
+          <w:bCs/>
+          <w:sz w:val="23"/>
+          <w:szCs w:val="23"/>
+        </w:rPr>
+        <w:t>LAURA CRISTINA CERÓN MUÑOZ</w:t>
+      </w:r>
+      <w:r>
+        <w:rPr>
+          <w:rFonts w:ascii="Calibri" w:eastAsia="Calibri" w:hAnsi="Calibri" w:cs="Calibri"/>
+          <w:sz w:val="23"/>
+          <w:szCs w:val="23"/>
+        </w:rPr>
+        <w:t xml:space="preserve"> identificada con la </w:t>
+      </w:r>
+      <w:r>
+        <w:rPr>
+          <w:rFonts w:ascii="Calibri" w:eastAsia="Calibri" w:hAnsi="Calibri" w:cs="Calibri"/>
+          <w:b/>
+          <w:bCs/>
+          <w:sz w:val="23"/>
+          <w:szCs w:val="23"/>
+        </w:rPr>
+        <w:t>CC No. 52.705.312</w:t>
+      </w:r>
+      <w:r>
+        <w:rPr>
+          <w:rFonts w:ascii="Calibri" w:eastAsia="Calibri" w:hAnsi="Calibri" w:cs="Calibri"/>
+          <w:sz w:val="23"/>
+          <w:szCs w:val="23"/>
+        </w:rPr>
+        <w:t xml:space="preserve"> y quien actúa en representación de </w:t>
+      </w:r>
+      <w:r>
+        <w:rPr>
+          <w:rFonts w:ascii="Calibri" w:eastAsia="Calibri" w:hAnsi="Calibri" w:cs="Calibri"/>
+          <w:b/>
+          <w:bCs/>
+          <w:sz w:val="23"/>
+          <w:szCs w:val="23"/>
+        </w:rPr>
+        <w:t>DIACO S.A.,</w:t>
+      </w:r>
+      <w:r>
+        <w:rPr>
+          <w:rFonts w:ascii="Calibri" w:eastAsia="Calibri" w:hAnsi="Calibri" w:cs="Calibri"/>
+          <w:sz w:val="23"/>
+          <w:szCs w:val="23"/>
+        </w:rPr>
+        <w:t xml:space="preserve"> con el fin de suscribir un acuerdo provisto de las siguientes cláusulas:</w:t>
+      </w:r>
+    </w:p>
+    <w:p>
+      <w:pPr>
+        <w:spacing w:line="240" w:lineRule="auto"/>
+        <w:jc w:val="both"/>
+        <w:rPr>
+          <w:rFonts w:ascii="Calibri" w:eastAsia="Calibri" w:hAnsi="Calibri" w:cs="Calibri"/>
+          <w:sz w:val="23"/>
+          <w:szCs w:val="23"/>
+        </w:rPr>
+      </w:pPr>
+    </w:p>
+    <w:p>
+      <w:pPr>
+        <w:spacing w:line="240" w:lineRule="auto"/>
+        <w:jc w:val="both"/>
+        <w:rPr>
+          <w:rFonts w:ascii="Calibri" w:eastAsia="Calibri" w:hAnsi="Calibri" w:cs="Calibri"/>
+          <w:sz w:val="23"/>
+          <w:szCs w:val="23"/>
+        </w:rPr>
+      </w:pPr>
+      <w:r>
+        <w:rPr>
+          <w:rFonts w:ascii="Calibri" w:eastAsia="Calibri" w:hAnsi="Calibri" w:cs="Calibri"/>
+          <w:b/>
+          <w:bCs/>
+          <w:sz w:val="23"/>
+          <w:szCs w:val="23"/>
+        </w:rPr>
+        <w:t>PRIMERA:</w:t>
+      </w:r>
+      <w:r>
+        <w:rPr>
+          <w:rFonts w:ascii="Calibri" w:eastAsia="Calibri" w:hAnsi="Calibri" w:cs="Calibri"/>
+          <w:sz w:val="23"/>
+          <w:szCs w:val="23"/>
+        </w:rPr>
+        <w:t xml:space="preserve"> El empleador de mera liberalidad y como parte de su política de bienestar otorga al trabajador un   auxilio de alimentación. </w:t>
+      </w:r>
+    </w:p>
+    <w:p>
+      <w:pPr>
+        <w:spacing w:line="240" w:lineRule="auto"/>
+        <w:jc w:val="both"/>
+        <w:rPr>
+          <w:rFonts w:ascii="Calibri" w:eastAsia="Calibri" w:hAnsi="Calibri" w:cs="Calibri"/>
+          <w:sz w:val="23"/>
+          <w:szCs w:val="23"/>
+        </w:rPr>
+      </w:pPr>
+    </w:p>
+    <w:p>
+      <w:pPr>
+        <w:spacing w:line="240" w:lineRule="auto"/>
+        <w:jc w:val="both"/>
+        <w:rPr>
+          <w:rFonts w:ascii="Calibri" w:eastAsia="Calibri" w:hAnsi="Calibri" w:cs="Calibri"/>
+          <w:color w:val="FF0000"/>
+          <w:sz w:val="23"/>
+          <w:szCs w:val="23"/>
+        </w:rPr>
+      </w:pPr>
+      <w:r>
+        <w:rPr>
+          <w:rFonts w:ascii="Calibri" w:eastAsia="Calibri" w:hAnsi="Calibri" w:cs="Calibri"/>
+          <w:sz w:val="23"/>
+          <w:szCs w:val="23"/>
+        </w:rPr>
+        <w:t xml:space="preserve">Con esta finalidad, las partes han convenido que por cada día laborado el trabajador recibe un valor de </w:t>
+      </w:r>
+      <w:r>
+        <w:rPr>
+          <w:rFonts w:ascii="Calibri" w:eastAsia="Calibri" w:hAnsi="Calibri" w:cs="Calibri"/>
+          <w:b/>
+          <w:bCs/>
+        </w:rPr>
+        <w:t>[[SalarioLetras]]</w:t>
+      </w:r>
+      <w:r>
+        <w:rPr>
+          <w:rFonts w:ascii="Calibri" w:eastAsia="Calibri" w:hAnsi="Calibri" w:cs="Calibri"/>
+          <w:b/>
+          <w:bCs/>
+        </w:rPr>
+        <w:t xml:space="preserve"> MCTE. (</w:t>
+      </w:r>
+      <w:r>
+        <w:rPr>
+          <w:rFonts w:ascii="Calibri" w:eastAsia="Calibri" w:hAnsi="Calibri" w:cs="Calibri"/>
+          <w:b/>
+          <w:bCs/>
+        </w:rPr>
+        <w:t>[[Salario]]</w:t>
+      </w:r>
+      <w:r>
+        <w:rPr>
+          <w:rFonts w:ascii="Calibri" w:eastAsia="Calibri" w:hAnsi="Calibri" w:cs="Calibri"/>
+          <w:b/>
+          <w:bCs/>
+        </w:rPr>
+        <w:t xml:space="preserve">) </w:t>
+      </w:r>
+      <w:r>
+        <w:rPr>
+          <w:rFonts w:ascii="Calibri" w:eastAsia="Calibri" w:hAnsi="Calibri" w:cs="Calibri"/>
+          <w:sz w:val="23"/>
+          <w:szCs w:val="23"/>
+        </w:rPr>
+        <w:t xml:space="preserve">por día trabajado, por medio de una tarjeta recargable con la cual podrá acceder a comprar alimentos en los establecimientos que tengan y acepten el convenio con la entidad expendedora de las tarjetas. </w:t>
+      </w:r>
+    </w:p>
+    <w:p>
+      <w:pPr>
+        <w:spacing w:line="240" w:lineRule="auto"/>
+        <w:jc w:val="both"/>
+        <w:rPr>
+          <w:rFonts w:ascii="Calibri" w:eastAsia="Calibri" w:hAnsi="Calibri" w:cs="Calibri"/>
+          <w:color w:val="FF0000"/>
+          <w:sz w:val="23"/>
+          <w:szCs w:val="23"/>
+        </w:rPr>
+      </w:pPr>
+    </w:p>
+    <w:p>
+      <w:pPr>
+        <w:spacing w:line="240" w:lineRule="auto"/>
+        <w:jc w:val="both"/>
+        <w:rPr>
+          <w:rFonts w:ascii="Calibri" w:eastAsia="Calibri" w:hAnsi="Calibri" w:cs="Calibri"/>
+          <w:sz w:val="23"/>
+          <w:szCs w:val="23"/>
+        </w:rPr>
+      </w:pPr>
+      <w:r>
+        <w:rPr>
+          <w:rFonts w:ascii="Calibri" w:eastAsia="Calibri" w:hAnsi="Calibri" w:cs="Calibri"/>
+          <w:b/>
+          <w:bCs/>
+          <w:sz w:val="23"/>
+          <w:szCs w:val="23"/>
+        </w:rPr>
+        <w:t>SEGUNDA:</w:t>
+      </w:r>
+      <w:r>
+        <w:rPr>
+          <w:rFonts w:ascii="Calibri" w:eastAsia="Calibri" w:hAnsi="Calibri" w:cs="Calibri"/>
+          <w:sz w:val="23"/>
+          <w:szCs w:val="23"/>
+        </w:rPr>
+        <w:t xml:space="preserve"> Las partes convienen y así lo hacen constar que el beneficio extralegal que mediante este acuerdo se otorga, en tanto constituye un subsidio de alimentación que no tiene por finalidad retribuir de manera directa el servicio, no constituye salario para ningún efecto legal conforme a lo estipulado en el artículo 15 de la Ley 50 de 1990. </w:t>
+      </w:r>
+    </w:p>
+    <w:p>
+      <w:pPr>
+        <w:spacing w:line="240" w:lineRule="auto"/>
+        <w:jc w:val="both"/>
+        <w:rPr>
+          <w:rFonts w:ascii="Calibri" w:eastAsia="Calibri" w:hAnsi="Calibri" w:cs="Calibri"/>
+          <w:sz w:val="23"/>
+          <w:szCs w:val="23"/>
+        </w:rPr>
+      </w:pPr>
+    </w:p>
+    <w:p>
+      <w:pPr>
+        <w:spacing w:line="240" w:lineRule="auto"/>
+        <w:jc w:val="both"/>
+        <w:rPr>
+          <w:rFonts w:ascii="Calibri" w:eastAsia="Calibri" w:hAnsi="Calibri" w:cs="Calibri"/>
+          <w:sz w:val="23"/>
+          <w:szCs w:val="23"/>
+        </w:rPr>
+      </w:pPr>
+      <w:r>
+        <w:rPr>
+          <w:rFonts w:ascii="Calibri" w:eastAsia="Calibri" w:hAnsi="Calibri" w:cs="Calibri"/>
+          <w:b/>
+          <w:bCs/>
+          <w:sz w:val="23"/>
+          <w:szCs w:val="23"/>
+        </w:rPr>
+        <w:t>TERCERA:</w:t>
+      </w:r>
+      <w:r>
+        <w:rPr>
+          <w:rFonts w:ascii="Calibri" w:eastAsia="Calibri" w:hAnsi="Calibri" w:cs="Calibri"/>
+          <w:sz w:val="23"/>
+          <w:szCs w:val="23"/>
+        </w:rPr>
+        <w:t xml:space="preserve"> Las partes declaran y así lo hacen constar que el presente beneficio, en tanto deriva de la mera liberalidad de la empresa, podrá ser modificado o eliminado de manera unilateral por la compañía cuando las necesidades así lo ameriten, sin que por ello se entienda desmejora en las condiciones del trabajador.</w:t>
+      </w:r>
+    </w:p>
+    <w:p>
+      <w:pPr>
+        <w:spacing w:line="240" w:lineRule="auto"/>
+        <w:jc w:val="both"/>
+        <w:rPr>
+          <w:rFonts w:ascii="Calibri" w:eastAsia="Calibri" w:hAnsi="Calibri" w:cs="Calibri"/>
+          <w:sz w:val="23"/>
+          <w:szCs w:val="23"/>
+        </w:rPr>
+      </w:pPr>
+    </w:p>
+    <w:p>
+      <w:pPr>
+        <w:spacing w:line="240" w:lineRule="auto"/>
+        <w:jc w:val="both"/>
+        <w:rPr>
+          <w:rFonts w:ascii="Calibri" w:eastAsia="Calibri" w:hAnsi="Calibri" w:cs="Calibri"/>
+          <w:sz w:val="23"/>
+          <w:szCs w:val="23"/>
+        </w:rPr>
+      </w:pPr>
+      <w:r>
+        <w:rPr>
+          <w:rFonts w:ascii="Calibri" w:eastAsia="Calibri" w:hAnsi="Calibri" w:cs="Calibri"/>
+          <w:sz w:val="23"/>
+          <w:szCs w:val="23"/>
+        </w:rPr>
+        <w:t>Ratifico que, desde el primer pago recibido por concepto de auxilio de alimentación, este fue pactado como no salarial por las partes.</w:t>
+      </w:r>
+    </w:p>
+    <w:p>
+      <w:pPr>
+        <w:spacing w:line="240" w:lineRule="auto"/>
+        <w:jc w:val="both"/>
+        <w:rPr>
+          <w:rFonts w:ascii="Calibri" w:eastAsia="Calibri" w:hAnsi="Calibri" w:cs="Calibri"/>
+          <w:sz w:val="23"/>
+          <w:szCs w:val="23"/>
+        </w:rPr>
+      </w:pPr>
+    </w:p>
+    <w:p>
+      <w:pPr>
+        <w:spacing w:line="240" w:lineRule="auto"/>
+        <w:jc w:val="both"/>
+        <w:rPr>
+          <w:rFonts w:ascii="Calibri" w:eastAsia="Calibri" w:hAnsi="Calibri" w:cs="Calibri"/>
+          <w:sz w:val="23"/>
+          <w:szCs w:val="23"/>
+        </w:rPr>
+      </w:pPr>
+    </w:p>
+    <w:p>
+      <w:pPr>
+        <w:spacing w:line="240" w:lineRule="auto"/>
+        <w:jc w:val="both"/>
+        <w:rPr>
+          <w:rFonts w:ascii="Calibri" w:eastAsia="Calibri" w:hAnsi="Calibri" w:cs="Calibri"/>
+          <w:sz w:val="23"/>
+          <w:szCs w:val="23"/>
+        </w:rPr>
+      </w:pPr>
+      <w:r>
+        <w:rPr>
+          <w:rFonts w:ascii="Calibri" w:eastAsia="Calibri" w:hAnsi="Calibri" w:cs="Calibri"/>
+          <w:sz w:val="23"/>
+          <w:szCs w:val="23"/>
+        </w:rPr>
+        <w:t xml:space="preserve">En constancia se firma en la ciudad de </w:t>
+      </w:r>
+      <w:r>
+        <w:rPr>
+          <w:rFonts w:ascii="Calibri" w:eastAsia="Calibri" w:hAnsi="Calibri" w:cs="Calibri"/>
+          <w:b/>
+          <w:bCs/>
+          <w:sz w:val="23"/>
+          <w:szCs w:val="23"/>
+          <w:lang w:val="es-ES"/>
+        </w:rPr>
+        <w:t>[[Ciudad</w:t>
+      </w:r>
+      <w:r>
+        <w:rPr>
+          <w:rFonts w:ascii="Calibri" w:eastAsia="Calibri" w:hAnsi="Calibri" w:cs="Calibri"/>
+          <w:b/>
+          <w:bCs/>
+          <w:sz w:val="23"/>
+          <w:szCs w:val="23"/>
+          <w:lang w:val="es-ES"/>
+        </w:rPr>
+        <w:t>Firma</w:t>
+      </w:r>
+      <w:r>
+        <w:rPr>
+          <w:rFonts w:ascii="Calibri" w:eastAsia="Calibri" w:hAnsi="Calibri" w:cs="Calibri"/>
+          <w:b/>
+          <w:bCs/>
+          <w:sz w:val="23"/>
+          <w:szCs w:val="23"/>
+          <w:lang w:val="es-ES"/>
+        </w:rPr>
         <w:t>]]</w:t>
       </w:r>
       <w:r>
@@ -156,498 +540,19 @@
           <w:rFonts w:ascii="Calibri" w:eastAsia="Calibri" w:hAnsi="Calibri" w:cs="Calibri"/>
           <w:sz w:val="23"/>
           <w:szCs w:val="23"/>
-          <w:highlight w:val="magenta"/>
           <w:lang w:val="es-ES"/>
         </w:rPr>
-        <w:t xml:space="preserve"> se reunieron por una parte</w:t>
-      </w:r>
-      <w:r>
-        <w:rPr>
-          <w:rFonts w:ascii="Calibri" w:eastAsia="Calibri" w:hAnsi="Calibri" w:cs="Calibri"/>
+        <w:t xml:space="preserve"> a los </w:t>
+      </w:r>
+      <w:r>
+        <w:rPr>
+          <w:rFonts w:ascii="Calibri" w:eastAsia="Calibri" w:hAnsi="Calibri" w:cs="Calibri"/>
+          <w:b/>
+          <w:bCs/>
           <w:sz w:val="23"/>
           <w:szCs w:val="23"/>
           <w:lang w:val="es-ES"/>
         </w:rPr>
-        <w:t xml:space="preserve"> </w:t>
-      </w:r>
-      <w:r>
-        <w:rPr>
-          <w:rFonts w:ascii="Calibri" w:eastAsia="Calibri" w:hAnsi="Calibri" w:cs="Calibri"/>
-          <w:b/>
-          <w:bCs/>
-          <w:sz w:val="23"/>
-          <w:szCs w:val="23"/>
-          <w:lang w:val="es-ES"/>
-        </w:rPr>
-        <w:t>[[Nombre]]</w:t>
-      </w:r>
-      <w:r>
-        <w:rPr>
-          <w:rFonts w:ascii="Calibri" w:eastAsia="Calibri" w:hAnsi="Calibri" w:cs="Calibri"/>
-          <w:sz w:val="23"/>
-          <w:szCs w:val="23"/>
-          <w:lang w:val="es-ES"/>
-        </w:rPr>
-        <w:t xml:space="preserve"> identificado(a) </w:t>
-      </w:r>
-      <w:r>
-        <w:rPr>
-          <w:rFonts w:ascii="Calibri" w:eastAsia="Calibri" w:hAnsi="Calibri" w:cs="Calibri"/>
-          <w:b/>
-          <w:bCs/>
-          <w:sz w:val="23"/>
-          <w:szCs w:val="23"/>
-          <w:lang w:val="es-ES"/>
-        </w:rPr>
-        <w:t>CC No</w:t>
-      </w:r>
-      <w:r>
-        <w:rPr>
-          <w:rFonts w:ascii="Calibri" w:eastAsia="Calibri" w:hAnsi="Calibri" w:cs="Calibri"/>
-          <w:sz w:val="23"/>
-          <w:szCs w:val="23"/>
-          <w:lang w:val="es-ES"/>
-        </w:rPr>
-        <w:t xml:space="preserve"> </w:t>
-      </w:r>
-      <w:r>
-        <w:rPr>
-          <w:rFonts w:ascii="Calibri" w:eastAsia="Calibri" w:hAnsi="Calibri" w:cs="Calibri"/>
-          <w:b/>
-          <w:bCs/>
-          <w:sz w:val="23"/>
-          <w:szCs w:val="23"/>
-          <w:lang w:val="es-ES"/>
-        </w:rPr>
-        <w:t>[[Cedula]]</w:t>
-      </w:r>
-      <w:r>
-        <w:rPr>
-          <w:rFonts w:ascii="Calibri" w:eastAsia="Calibri" w:hAnsi="Calibri" w:cs="Calibri"/>
-          <w:b/>
-          <w:bCs/>
-          <w:sz w:val="23"/>
-          <w:szCs w:val="23"/>
-          <w:lang w:val="es-ES"/>
-        </w:rPr>
-        <w:t xml:space="preserve"> </w:t>
-      </w:r>
-      <w:r>
-        <w:rPr>
-          <w:rFonts w:ascii="Calibri" w:eastAsia="Calibri" w:hAnsi="Calibri" w:cs="Calibri"/>
-          <w:sz w:val="23"/>
-          <w:szCs w:val="23"/>
-        </w:rPr>
-        <w:t xml:space="preserve">como </w:t>
-      </w:r>
-      <w:r>
-        <w:rPr>
-          <w:rFonts w:ascii="Calibri" w:eastAsia="Calibri" w:hAnsi="Calibri" w:cs="Calibri"/>
-          <w:sz w:val="23"/>
-          <w:szCs w:val="23"/>
-        </w:rPr>
-        <w:t xml:space="preserve">aparece al pie de su firma y quien actúa en su propio nombre y por la otra, </w:t>
-      </w:r>
-      <w:r>
-        <w:rPr>
-          <w:rFonts w:ascii="Calibri" w:eastAsia="Calibri" w:hAnsi="Calibri" w:cs="Calibri"/>
-          <w:b/>
-          <w:bCs/>
-          <w:sz w:val="23"/>
-          <w:szCs w:val="23"/>
-        </w:rPr>
-        <w:t>LAURA CRISTINA CERÓN MUÑOZ</w:t>
-      </w:r>
-      <w:r>
-        <w:rPr>
-          <w:rFonts w:ascii="Calibri" w:eastAsia="Calibri" w:hAnsi="Calibri" w:cs="Calibri"/>
-          <w:sz w:val="23"/>
-          <w:szCs w:val="23"/>
-        </w:rPr>
-        <w:t xml:space="preserve"> identificada con la </w:t>
-      </w:r>
-      <w:r>
-        <w:rPr>
-          <w:rFonts w:ascii="Calibri" w:eastAsia="Calibri" w:hAnsi="Calibri" w:cs="Calibri"/>
-          <w:b/>
-          <w:bCs/>
-          <w:sz w:val="23"/>
-          <w:szCs w:val="23"/>
-        </w:rPr>
-        <w:t>CC No. 52.705.312</w:t>
-      </w:r>
-      <w:r>
-        <w:rPr>
-          <w:rFonts w:ascii="Calibri" w:eastAsia="Calibri" w:hAnsi="Calibri" w:cs="Calibri"/>
-          <w:sz w:val="23"/>
-          <w:szCs w:val="23"/>
-        </w:rPr>
-        <w:t xml:space="preserve"> y quien actúa en representación de </w:t>
-      </w:r>
-      <w:r>
-        <w:rPr>
-          <w:rFonts w:ascii="Calibri" w:eastAsia="Calibri" w:hAnsi="Calibri" w:cs="Calibri"/>
-          <w:b/>
-          <w:bCs/>
-          <w:sz w:val="23"/>
-          <w:szCs w:val="23"/>
-        </w:rPr>
-        <w:t>DIACO S.A.,</w:t>
-      </w:r>
-      <w:r>
-        <w:rPr>
-          <w:rFonts w:ascii="Calibri" w:eastAsia="Calibri" w:hAnsi="Calibri" w:cs="Calibri"/>
-          <w:sz w:val="23"/>
-          <w:szCs w:val="23"/>
-        </w:rPr>
-        <w:t xml:space="preserve"> con el fin de suscribir un acuerdo provisto de las siguientes c</w:t>
-      </w:r>
-      <w:r>
-        <w:rPr>
-          <w:rFonts w:ascii="Calibri" w:eastAsia="Calibri" w:hAnsi="Calibri" w:cs="Calibri"/>
-          <w:sz w:val="23"/>
-          <w:szCs w:val="23"/>
-        </w:rPr>
-        <w:t>láusulas:</w:t>
-      </w:r>
-    </w:p>
-    <w:p>
-      <w:pPr>
-        <w:spacing w:line="240" w:lineRule="auto"/>
-        <w:jc w:val="both"/>
-        <w:rPr>
-          <w:rFonts w:ascii="Calibri" w:eastAsia="Calibri" w:hAnsi="Calibri" w:cs="Calibri"/>
-          <w:sz w:val="23"/>
-          <w:szCs w:val="23"/>
-        </w:rPr>
-      </w:pPr>
-    </w:p>
-    <w:p>
-      <w:pPr>
-        <w:spacing w:line="240" w:lineRule="auto"/>
-        <w:jc w:val="both"/>
-        <w:rPr>
-          <w:rFonts w:ascii="Calibri" w:eastAsia="Calibri" w:hAnsi="Calibri" w:cs="Calibri"/>
-          <w:sz w:val="23"/>
-          <w:szCs w:val="23"/>
-        </w:rPr>
-      </w:pPr>
-      <w:r>
-        <w:rPr>
-          <w:rFonts w:ascii="Calibri" w:eastAsia="Calibri" w:hAnsi="Calibri" w:cs="Calibri"/>
-          <w:b/>
-          <w:bCs/>
-          <w:sz w:val="23"/>
-          <w:szCs w:val="23"/>
-        </w:rPr>
-        <w:t>PRIMERA:</w:t>
-      </w:r>
-      <w:r>
-        <w:rPr>
-          <w:rFonts w:ascii="Calibri" w:eastAsia="Calibri" w:hAnsi="Calibri" w:cs="Calibri"/>
-          <w:sz w:val="23"/>
-          <w:szCs w:val="23"/>
-        </w:rPr>
-        <w:t xml:space="preserve"> El empleador de mera liberalidad y como parte de su política de bienestar otorga al trabajador un   auxilio de alimentación. </w:t>
-      </w:r>
-    </w:p>
-    <w:p>
-      <w:pPr>
-        <w:spacing w:line="240" w:lineRule="auto"/>
-        <w:jc w:val="both"/>
-        <w:rPr>
-          <w:rFonts w:ascii="Calibri" w:eastAsia="Calibri" w:hAnsi="Calibri" w:cs="Calibri"/>
-          <w:sz w:val="23"/>
-          <w:szCs w:val="23"/>
-        </w:rPr>
-      </w:pPr>
-    </w:p>
-    <w:p>
-      <w:pPr>
-        <w:spacing w:line="240" w:lineRule="auto"/>
-        <w:jc w:val="both"/>
-        <w:rPr>
-          <w:rFonts w:ascii="Calibri" w:eastAsia="Calibri" w:hAnsi="Calibri" w:cs="Calibri"/>
-          <w:color w:val="FF0000"/>
-          <w:sz w:val="23"/>
-          <w:szCs w:val="23"/>
-        </w:rPr>
-      </w:pPr>
-      <w:r>
-        <w:rPr>
-          <w:rFonts w:ascii="Calibri" w:eastAsia="Calibri" w:hAnsi="Calibri" w:cs="Calibri"/>
-          <w:sz w:val="23"/>
-          <w:szCs w:val="23"/>
-        </w:rPr>
-        <w:t xml:space="preserve">Con esta finalidad, las partes han convenido que por cada día laborado el trabajador recibe un valor de </w:t>
-      </w:r>
-      <w:r>
-        <w:rPr>
-          <w:rFonts w:ascii="Calibri" w:eastAsia="Calibri" w:hAnsi="Calibri" w:cs="Calibri"/>
-          <w:b/>
-          <w:bCs/>
-        </w:rPr>
-        <w:t>QUINC</w:t>
-      </w:r>
-      <w:r>
-        <w:rPr>
-          <w:rFonts w:ascii="Calibri" w:eastAsia="Calibri" w:hAnsi="Calibri" w:cs="Calibri"/>
-          <w:b/>
-          <w:bCs/>
-        </w:rPr>
-        <w:t xml:space="preserve">E MIL PESOS 00/100 MCTE. ($15.000,00) </w:t>
-      </w:r>
-      <w:r>
-        <w:rPr>
-          <w:rFonts w:ascii="Calibri" w:eastAsia="Calibri" w:hAnsi="Calibri" w:cs="Calibri"/>
-          <w:sz w:val="23"/>
-          <w:szCs w:val="23"/>
-        </w:rPr>
-        <w:t xml:space="preserve">por día trabajado, por medio de una tarjeta recargable con la cual podrá acceder a comprar alimentos en los establecimientos que tengan y acepten el convenio con la entidad expendedora de las tarjetas. </w:t>
-      </w:r>
-    </w:p>
-    <w:p>
-      <w:pPr>
-        <w:spacing w:line="240" w:lineRule="auto"/>
-        <w:jc w:val="both"/>
-        <w:rPr>
-          <w:rFonts w:ascii="Calibri" w:eastAsia="Calibri" w:hAnsi="Calibri" w:cs="Calibri"/>
-          <w:color w:val="FF0000"/>
-          <w:sz w:val="23"/>
-          <w:szCs w:val="23"/>
-        </w:rPr>
-      </w:pPr>
-    </w:p>
-    <w:p>
-      <w:pPr>
-        <w:spacing w:line="240" w:lineRule="auto"/>
-        <w:jc w:val="both"/>
-        <w:rPr>
-          <w:rFonts w:ascii="Calibri" w:eastAsia="Calibri" w:hAnsi="Calibri" w:cs="Calibri"/>
-          <w:sz w:val="23"/>
-          <w:szCs w:val="23"/>
-        </w:rPr>
-      </w:pPr>
-      <w:r>
-        <w:rPr>
-          <w:rFonts w:ascii="Calibri" w:eastAsia="Calibri" w:hAnsi="Calibri" w:cs="Calibri"/>
-          <w:b/>
-          <w:bCs/>
-          <w:sz w:val="23"/>
-          <w:szCs w:val="23"/>
-        </w:rPr>
-        <w:t>SEGUNDA:</w:t>
-      </w:r>
-      <w:r>
-        <w:rPr>
-          <w:rFonts w:ascii="Calibri" w:eastAsia="Calibri" w:hAnsi="Calibri" w:cs="Calibri"/>
-          <w:sz w:val="23"/>
-          <w:szCs w:val="23"/>
-        </w:rPr>
-        <w:t xml:space="preserve"> Las p</w:t>
-      </w:r>
-      <w:r>
-        <w:rPr>
-          <w:rFonts w:ascii="Calibri" w:eastAsia="Calibri" w:hAnsi="Calibri" w:cs="Calibri"/>
-          <w:sz w:val="23"/>
-          <w:szCs w:val="23"/>
-        </w:rPr>
-        <w:t>artes convienen y así lo hacen constar que el beneficio extralegal que mediante este acuerdo se otorga, en tanto constituye un subsidio de alimentación que no tiene por finalidad retribuir de manera directa el servicio, no constituye salario para ningún ef</w:t>
-      </w:r>
-      <w:r>
-        <w:rPr>
-          <w:rFonts w:ascii="Calibri" w:eastAsia="Calibri" w:hAnsi="Calibri" w:cs="Calibri"/>
-          <w:sz w:val="23"/>
-          <w:szCs w:val="23"/>
-        </w:rPr>
-        <w:t xml:space="preserve">ecto legal conforme a lo estipulado en el artículo 15 de la Ley 50 de 1990. </w:t>
-      </w:r>
-    </w:p>
-    <w:p>
-      <w:pPr>
-        <w:spacing w:line="240" w:lineRule="auto"/>
-        <w:jc w:val="both"/>
-        <w:rPr>
-          <w:rFonts w:ascii="Calibri" w:eastAsia="Calibri" w:hAnsi="Calibri" w:cs="Calibri"/>
-          <w:sz w:val="23"/>
-          <w:szCs w:val="23"/>
-        </w:rPr>
-      </w:pPr>
-    </w:p>
-    <w:p>
-      <w:pPr>
-        <w:spacing w:line="240" w:lineRule="auto"/>
-        <w:jc w:val="both"/>
-        <w:rPr>
-          <w:rFonts w:ascii="Calibri" w:eastAsia="Calibri" w:hAnsi="Calibri" w:cs="Calibri"/>
-          <w:sz w:val="23"/>
-          <w:szCs w:val="23"/>
-        </w:rPr>
-      </w:pPr>
-      <w:r>
-        <w:rPr>
-          <w:rFonts w:ascii="Calibri" w:eastAsia="Calibri" w:hAnsi="Calibri" w:cs="Calibri"/>
-          <w:b/>
-          <w:bCs/>
-          <w:sz w:val="23"/>
-          <w:szCs w:val="23"/>
-        </w:rPr>
-        <w:t>TERCERA:</w:t>
-      </w:r>
-      <w:r>
-        <w:rPr>
-          <w:rFonts w:ascii="Calibri" w:eastAsia="Calibri" w:hAnsi="Calibri" w:cs="Calibri"/>
-          <w:sz w:val="23"/>
-          <w:szCs w:val="23"/>
-        </w:rPr>
-        <w:t xml:space="preserve"> Las partes declaran y así lo hacen constar que el presente beneficio, en tanto deriva de la mera liberalidad de la empresa, podrá ser modificado o eliminado de manera un</w:t>
-      </w:r>
-      <w:r>
-        <w:rPr>
-          <w:rFonts w:ascii="Calibri" w:eastAsia="Calibri" w:hAnsi="Calibri" w:cs="Calibri"/>
-          <w:sz w:val="23"/>
-          <w:szCs w:val="23"/>
-        </w:rPr>
-        <w:t>ilateral por la compañía cuando las necesidades así lo ameriten, sin que por ello se entienda desmejora en las condiciones del trabajador.</w:t>
-      </w:r>
-    </w:p>
-    <w:p>
-      <w:pPr>
-        <w:spacing w:line="240" w:lineRule="auto"/>
-        <w:jc w:val="both"/>
-        <w:rPr>
-          <w:rFonts w:ascii="Calibri" w:eastAsia="Calibri" w:hAnsi="Calibri" w:cs="Calibri"/>
-          <w:sz w:val="23"/>
-          <w:szCs w:val="23"/>
-        </w:rPr>
-      </w:pPr>
-    </w:p>
-    <w:p>
-      <w:pPr>
-        <w:spacing w:line="240" w:lineRule="auto"/>
-        <w:jc w:val="both"/>
-        <w:rPr>
-          <w:rFonts w:ascii="Calibri" w:eastAsia="Calibri" w:hAnsi="Calibri" w:cs="Calibri"/>
-          <w:sz w:val="23"/>
-          <w:szCs w:val="23"/>
-        </w:rPr>
-      </w:pPr>
-      <w:r>
-        <w:rPr>
-          <w:rFonts w:ascii="Calibri" w:eastAsia="Calibri" w:hAnsi="Calibri" w:cs="Calibri"/>
-          <w:sz w:val="23"/>
-          <w:szCs w:val="23"/>
-        </w:rPr>
-        <w:t>Ratifico que, desde el primer pago recibido por concepto de auxilio de alimentación, este fue pactado como no salari</w:t>
-      </w:r>
-      <w:r>
-        <w:rPr>
-          <w:rFonts w:ascii="Calibri" w:eastAsia="Calibri" w:hAnsi="Calibri" w:cs="Calibri"/>
-          <w:sz w:val="23"/>
-          <w:szCs w:val="23"/>
-        </w:rPr>
-        <w:t>al por las partes.</w:t>
-      </w:r>
-    </w:p>
-    <w:p>
-      <w:pPr>
-        <w:spacing w:line="240" w:lineRule="auto"/>
-        <w:jc w:val="both"/>
-        <w:rPr>
-          <w:rFonts w:ascii="Calibri" w:eastAsia="Calibri" w:hAnsi="Calibri" w:cs="Calibri"/>
-          <w:sz w:val="23"/>
-          <w:szCs w:val="23"/>
-        </w:rPr>
-      </w:pPr>
-    </w:p>
-    <w:p>
-      <w:pPr>
-        <w:spacing w:line="240" w:lineRule="auto"/>
-        <w:jc w:val="both"/>
-        <w:rPr>
-          <w:rFonts w:ascii="Calibri" w:eastAsia="Calibri" w:hAnsi="Calibri" w:cs="Calibri"/>
-          <w:sz w:val="23"/>
-          <w:szCs w:val="23"/>
-        </w:rPr>
-      </w:pPr>
-    </w:p>
-    <w:p>
-      <w:pPr>
-        <w:spacing w:line="240" w:lineRule="auto"/>
-        <w:jc w:val="both"/>
-        <w:rPr>
-          <w:rFonts w:ascii="Calibri" w:eastAsia="Calibri" w:hAnsi="Calibri" w:cs="Calibri"/>
-          <w:sz w:val="23"/>
-          <w:szCs w:val="23"/>
-        </w:rPr>
-      </w:pPr>
-      <w:r>
-        <w:rPr>
-          <w:rFonts w:ascii="Calibri" w:eastAsia="Calibri" w:hAnsi="Calibri" w:cs="Calibri"/>
-          <w:sz w:val="23"/>
-          <w:szCs w:val="23"/>
-          <w:highlight w:val="magenta"/>
-        </w:rPr>
-        <w:t xml:space="preserve">En constancia se firma en la ciudad de </w:t>
-      </w:r>
-      <w:r>
-        <w:rPr>
-          <w:rFonts w:ascii="Calibri" w:eastAsia="Calibri" w:hAnsi="Calibri" w:cs="Calibri"/>
-          <w:b/>
-          <w:bCs/>
-          <w:sz w:val="23"/>
-          <w:szCs w:val="23"/>
-          <w:highlight w:val="magenta"/>
-          <w:lang w:val="es-ES"/>
-        </w:rPr>
-        <w:t>[[</w:t>
-      </w:r>
-      <w:proofErr w:type="spellStart"/>
-      <w:r>
-        <w:rPr>
-          <w:rFonts w:ascii="Calibri" w:eastAsia="Calibri" w:hAnsi="Calibri" w:cs="Calibri"/>
-          <w:b/>
-          <w:bCs/>
-          <w:sz w:val="23"/>
-          <w:szCs w:val="23"/>
-          <w:highlight w:val="magenta"/>
-          <w:lang w:val="es-ES"/>
-        </w:rPr>
-        <w:t>CiudadWork</w:t>
-      </w:r>
-      <w:proofErr w:type="spellEnd"/>
-      <w:r>
-        <w:rPr>
-          <w:rFonts w:ascii="Calibri" w:eastAsia="Calibri" w:hAnsi="Calibri" w:cs="Calibri"/>
-          <w:b/>
-          <w:bCs/>
-          <w:sz w:val="23"/>
-          <w:szCs w:val="23"/>
-          <w:highlight w:val="magenta"/>
-          <w:lang w:val="es-ES"/>
-        </w:rPr>
-        <w:t>]]</w:t>
-      </w:r>
-      <w:r>
-        <w:rPr>
-          <w:rFonts w:ascii="Calibri" w:eastAsia="Calibri" w:hAnsi="Calibri" w:cs="Calibri"/>
-          <w:sz w:val="23"/>
-          <w:szCs w:val="23"/>
-          <w:highlight w:val="magenta"/>
-          <w:lang w:val="es-ES"/>
-        </w:rPr>
-        <w:t xml:space="preserve"> a los </w:t>
-      </w:r>
-      <w:r>
-        <w:rPr>
-          <w:rFonts w:ascii="Calibri" w:eastAsia="Calibri" w:hAnsi="Calibri" w:cs="Calibri"/>
-          <w:b/>
-          <w:bCs/>
-          <w:sz w:val="23"/>
-          <w:szCs w:val="23"/>
-          <w:highlight w:val="magenta"/>
-          <w:lang w:val="es-ES"/>
-        </w:rPr>
         <w:t>[[FechaLarga]]</w:t>
       </w:r>
       <w:r>
@@ -655,7 +560,6 @@
           <w:rFonts w:ascii="Calibri" w:eastAsia="Calibri" w:hAnsi="Calibri" w:cs="Calibri"/>
           <w:sz w:val="23"/>
           <w:szCs w:val="23"/>
-          <w:highlight w:val="magenta"/>
         </w:rPr>
         <w:t>.</w:t>
       </w:r>
@@ -870,17 +774,7 @@
           <w:lang w:val="en-US"/>
         </w:rPr>
         <w:tab/>
-        <w:t xml:space="preserve"> </w:t>
-      </w:r>
-      <w:r>
-        <w:rPr>
-          <w:rFonts w:ascii="Calibri" w:eastAsia="Calibri" w:hAnsi="Calibri" w:cs="Calibri"/>
-          <w:sz w:val="23"/>
-          <w:szCs w:val="23"/>
-          <w:highlight w:val="magenta"/>
-          <w:lang w:val="en-US"/>
-        </w:rPr>
-        <w:t xml:space="preserve">C.C. </w:t>
+        <w:t xml:space="preserve"> C.C. </w:t>
       </w:r>
       <w:r>
         <w:rPr>

</xml_diff>